<commit_message>
updated light exposure trial dates and removed duplicates
</commit_message>
<xml_diff>
--- a/output/tables/table_summary.docx
+++ b/output/tables/table_summary.docx
@@ -286,7 +286,7 @@
                 <w:rFonts w:ascii="Calibri" w:hAnsi="Calibri"/>
                 <w:sz w:val="20"/>
               </w:rPr>
-              <w:t xml:space="default">&lt;strong&gt;101&lt;/strong&gt; (6 - 7)</w:t>
+              <w:t xml:space="default">&lt;strong&gt;118&lt;/strong&gt; (6 - 8)</w:t>
             </w:r>
           </w:p>
         </w:tc>
@@ -387,7 +387,7 @@
                 <w:rFonts w:ascii="Calibri" w:hAnsi="Calibri"/>
                 <w:sz w:val="20"/>
               </w:rPr>
-              <w:t xml:space="default">&lt;strong&gt;73&lt;/strong&gt; (4 - 5)</w:t>
+              <w:t xml:space="default">&lt;strong&gt;87&lt;/strong&gt; (4 - 6)</w:t>
             </w:r>
           </w:p>
         </w:tc>
@@ -488,7 +488,7 @@
                 <w:rFonts w:ascii="Calibri" w:hAnsi="Calibri"/>
                 <w:sz w:val="20"/>
               </w:rPr>
-              <w:t xml:space="default">&lt;strong&gt;13.0%&lt;/strong&gt; (6.0% - 22.0%)</w:t>
+              <w:t xml:space="default">&lt;strong&gt;16.0%&lt;/strong&gt; (13.0% - 26.0%)</w:t>
             </w:r>
           </w:p>
         </w:tc>
@@ -742,7 +742,7 @@
                 <w:rFonts w:ascii="Calibri" w:hAnsi="Calibri"/>
                 <w:sz w:val="20"/>
               </w:rPr>
-              <w:t xml:space="default">&lt;strong&gt;11,128&lt;/strong&gt; ±9,440 (35 - 46,468)</w:t>
+              <w:t xml:space="default">&lt;strong&gt;12,033&lt;/strong&gt; ±10,439 (44 - 55,493)</w:t>
             </w:r>
           </w:p>
         </w:tc>
@@ -852,7 +852,7 @@
                 <w:rFonts w:ascii="Calibri" w:hAnsi="Calibri"/>
                 <w:sz w:val="20"/>
               </w:rPr>
-              <w:t xml:space="default">&lt;strong&gt;2h 4m&lt;/strong&gt; ±1h 47m (0s - 6h 36m)</w:t>
+              <w:t xml:space="default">&lt;strong&gt;1h 45m&lt;/strong&gt; ±1h 30m (0s - 6h 27m)</w:t>
             </w:r>
           </w:p>
         </w:tc>
@@ -962,7 +962,7 @@
                 <w:rFonts w:ascii="Calibri" w:hAnsi="Calibri"/>
                 <w:sz w:val="20"/>
               </w:rPr>
-              <w:t xml:space="default">&lt;strong&gt;3h 36m&lt;/strong&gt; ±1h 56m (27m 40s - 9h 41m)</w:t>
+              <w:t xml:space="default">&lt;strong&gt;3h 31m&lt;/strong&gt; ±2h 33m (11m 30s - 11h 26m)</w:t>
             </w:r>
           </w:p>
         </w:tc>
@@ -1072,7 +1072,7 @@
                 <w:rFonts w:ascii="Calibri" w:hAnsi="Calibri"/>
                 <w:sz w:val="20"/>
               </w:rPr>
-              <w:t xml:space="default">&lt;strong&gt;11h 57m&lt;/strong&gt; ±4h 12m (1h 48m - 21h 30m)</w:t>
+              <w:t xml:space="default">&lt;strong&gt;12h 26m&lt;/strong&gt; ±3h 59m (1h 37m - 22h 24m)</w:t>
             </w:r>
           </w:p>
         </w:tc>
@@ -1182,7 +1182,7 @@
                 <w:rFonts w:ascii="Calibri" w:hAnsi="Calibri"/>
                 <w:sz w:val="20"/>
               </w:rPr>
-              <w:t xml:space="default">&lt;strong&gt;23m 31s&lt;/strong&gt; ±19m 34s (0s - 1h 20m)</w:t>
+              <w:t xml:space="default">&lt;strong&gt;25m 57s&lt;/strong&gt; ±21m 39s (0s - 2h 11m)</w:t>
             </w:r>
           </w:p>
         </w:tc>
@@ -1292,7 +1292,7 @@
                 <w:rFonts w:ascii="Calibri" w:hAnsi="Calibri"/>
                 <w:sz w:val="20"/>
               </w:rPr>
-              <w:t xml:space="default">&lt;strong&gt;1h 10m&lt;/strong&gt; ±1h 4m (0s - 5h 20m)</w:t>
+              <w:t xml:space="default">&lt;strong&gt;1h 5m&lt;/strong&gt; ±59m 38s (0s - 5h 23m)</w:t>
             </w:r>
           </w:p>
         </w:tc>
@@ -1402,7 +1402,7 @@
                 <w:rFonts w:ascii="Calibri" w:hAnsi="Calibri"/>
                 <w:sz w:val="20"/>
               </w:rPr>
-              <w:t xml:space="default">&lt;strong&gt;08:39&lt;/strong&gt; ±01:48 (06:02 - 15:05)</w:t>
+              <w:t xml:space="default">&lt;strong&gt;08:59&lt;/strong&gt; ±02:06 (00:00 - 17:31)</w:t>
             </w:r>
           </w:p>
         </w:tc>
@@ -1521,7 +1521,7 @@
                 <w:rFonts w:ascii="Calibri" w:hAnsi="Calibri"/>
                 <w:sz w:val="20"/>
               </w:rPr>
-              <w:t xml:space="default">&lt;strong&gt;12:26&lt;/strong&gt; ±01:35 (08:44 - 16:45)</w:t>
+              <w:t xml:space="default">&lt;strong&gt;12:23&lt;/strong&gt; ±01:54 (03:07 - 17:31)</w:t>
             </w:r>
           </w:p>
         </w:tc>
@@ -1640,7 +1640,7 @@
                 <w:rFonts w:ascii="Calibri" w:hAnsi="Calibri"/>
                 <w:sz w:val="20"/>
               </w:rPr>
-              <w:t xml:space="default">&lt;strong&gt;17:02&lt;/strong&gt; ±02:22 (09:02 - 23:47)</w:t>
+              <w:t xml:space="default">&lt;strong&gt;16:49&lt;/strong&gt; ±02:08 (11:13 - 22:57)</w:t>
             </w:r>
           </w:p>
         </w:tc>
@@ -1759,7 +1759,7 @@
                 <w:rFonts w:ascii="Calibri" w:hAnsi="Calibri"/>
                 <w:sz w:val="20"/>
               </w:rPr>
-              <w:t xml:space="default">&lt;strong&gt;13:07&lt;/strong&gt; ±01:34 (10:09 - 18:14)</w:t>
+              <w:t xml:space="default">&lt;strong&gt;13:09&lt;/strong&gt; ±02:05 (05:06 - 18:51)</w:t>
             </w:r>
           </w:p>
         </w:tc>
@@ -1878,7 +1878,7 @@
                 <w:rFonts w:ascii="Calibri" w:hAnsi="Calibri"/>
                 <w:sz w:val="20"/>
               </w:rPr>
-              <w:t xml:space="default">&lt;strong&gt;04:38&lt;/strong&gt; ±05:14 (01:02 - 23:58)</w:t>
+              <w:t xml:space="default">&lt;strong&gt;04:16&lt;/strong&gt; ±05:01 (00:03 - 23:41)</w:t>
             </w:r>
           </w:p>
         </w:tc>
@@ -2013,7 +2013,7 @@
                 <w:rFonts w:ascii="Calibri" w:hAnsi="Calibri"/>
                 <w:sz w:val="20"/>
               </w:rPr>
-              <w:t xml:space="default">&lt;strong&gt;72.8&lt;/strong&gt; ±104.7 (0.3 - 629.7)</w:t>
+              <w:t xml:space="default">&lt;strong&gt;63.7&lt;/strong&gt; ±85.7 (0.2 - 452.8)</w:t>
             </w:r>
           </w:p>
         </w:tc>
@@ -2139,7 +2139,7 @@
                 <w:rFonts w:ascii="Calibri" w:hAnsi="Calibri"/>
                 <w:sz w:val="20"/>
               </w:rPr>
-              <w:t xml:space="default">&lt;strong&gt;0.1&lt;/strong&gt; ±0.9 (0.0 - 7.2)</w:t>
+              <w:t xml:space="default">&lt;strong&gt;0.1&lt;/strong&gt; ±0.7 (0.0 - 6.7)</w:t>
             </w:r>
           </w:p>
         </w:tc>
@@ -2240,7 +2240,7 @@
                 <w:rFonts w:ascii="Calibri" w:hAnsi="Calibri"/>
                 <w:sz w:val="20"/>
               </w:rPr>
-              <w:t xml:space="default">&lt;strong&gt;0.336&lt;/strong&gt; ±0.072 (0.234 - 0.503)</w:t>
+              <w:t xml:space="default">&lt;strong&gt;0.304&lt;/strong&gt; ±0.085 (0.182 - 0.517)</w:t>
             </w:r>
           </w:p>
         </w:tc>
@@ -2341,7 +2341,7 @@
                 <w:rFonts w:ascii="Calibri" w:hAnsi="Calibri"/>
                 <w:sz w:val="20"/>
               </w:rPr>
-              <w:t xml:space="default">&lt;strong&gt;1.506&lt;/strong&gt; ±0.353 (0.692 - 1.993)</w:t>
+              <w:t xml:space="default">&lt;strong&gt;1.440&lt;/strong&gt; ±0.392 (0.614 - 2.019)</w:t>
             </w:r>
           </w:p>
         </w:tc>
@@ -2452,7 +2452,7 @@
                 <w:rFonts w:ascii="Calibri" w:hAnsi="Calibri"/>
                 <w:sz w:val="20"/>
               </w:rPr>
-              <w:t xml:space="default">Metrics are calculated on a by-participant-day basis (n=73) with the exception of IV and IS, which are calculated on a by-participant basis (n=15).</w:t>
+              <w:t xml:space="default">Metrics are calculated on a by-participant-day basis (n=87) with the exception of IV and IS, which are calculated on a by-participant basis (n=15).</w:t>
             </w:r>
           </w:p>
         </w:tc>

</xml_diff>